<commit_message>
fix(syndic): compte rendu Word avec feuille de présence et quorum en français
Co-Authored-By: Claude Sonnet 5.5 <noreply@anthropic.com>
</commit_message>
<xml_diff>
--- a/assets/modeles_standard/compte_rendu_assemblee_generale.docx
+++ b/assets/modeles_standard/compte_rendu_assemblee_generale.docx
@@ -451,7 +451,7 @@
           <w:sz w:val="22"/>
           <w:szCs w:val="22"/>
         </w:rPr>
-        <w:t xml:space="preserve">ORDRE DU JOUR ET DISCUSSIONS</w:t>
+        <w:t xml:space="preserve">FEUILLE DE PRÉSENCE</w:t>
       </w:r>
     </w:p>
     <w:p>
@@ -459,44 +459,361 @@
         <w:spacing w:before="0" w:after="80" w:line="264" w:lineRule="auto"/>
       </w:pPr>
       <w:r>
-        <w:t xml:space="preserve">{{^AGENDA_ITEMS}}- Aucun point d’ordre du jour renseigné.{{/AGENDA_ITEMS}}</w:t>
-      </w:r>
-    </w:p>
-    <w:p>
-      <w:pPr>
-        <w:spacing w:before="0" w:after="80" w:line="264" w:lineRule="auto"/>
-      </w:pPr>
-      <w:r>
-        <w:t xml:space="preserve">{{#AGENDA_ITEMS}}</w:t>
-      </w:r>
-    </w:p>
-    <w:p>
-      <w:pPr>
-        <w:spacing w:before="0" w:after="80" w:line="264" w:lineRule="auto"/>
-      </w:pPr>
-      <w:r>
-        <w:rPr>
-          <w:b/>
-          <w:bCs/>
-        </w:rPr>
-        <w:t xml:space="preserve">{{AGENDA_INDEX}}. {{AGENDA_TITLE}}</w:t>
-      </w:r>
-    </w:p>
-    <w:p>
-      <w:pPr>
-        <w:spacing w:before="0" w:after="80" w:line="264" w:lineRule="auto"/>
-      </w:pPr>
-      <w:r>
-        <w:t xml:space="preserve">Discussion : {{AGENDA_DISCUSSION}}</w:t>
-      </w:r>
-    </w:p>
-    <w:p>
-      <w:pPr>
-        <w:spacing w:before="0" w:after="80" w:line="264" w:lineRule="auto"/>
-      </w:pPr>
-      <w:r>
-        <w:t xml:space="preserve">{{/AGENDA_ITEMS}}</w:t>
-      </w:r>
+        <w:t xml:space="preserve">{{ATTENDANCE_SUMMARY}}</w:t>
+      </w:r>
+    </w:p>
+    <w:tbl>
+      <w:tblPr>
+        <w:tblW w:w="9638" w:type="dxa"/>
+        <w:tblLayout w:type="fixed"/>
+        <w:tblCellMar>
+          <w:left w:w="0" w:type="dxa"/>
+          <w:right w:w="0" w:type="dxa"/>
+        </w:tblCellMar>
+      </w:tblPr>
+      <w:tblGrid>
+        <w:gridCol w:w="900"/>
+        <w:gridCol w:w="1300"/>
+        <w:gridCol w:w="3838"/>
+        <w:gridCol w:w="2000"/>
+        <w:gridCol w:w="1600"/>
+      </w:tblGrid>
+      <w:tr>
+        <w:trPr>
+          <w:cantSplit/>
+          <w:tblHeader/>
+        </w:trPr>
+        <w:tc>
+          <w:tcPr>
+            <w:tcW w:w="900" w:type="dxa"/>
+            <w:tcBorders>
+              <w:top w:val="single" w:sz="4" w:space="0" w:color="C9D3DF"/>
+              <w:left w:val="single" w:sz="4" w:space="0" w:color="C9D3DF"/>
+              <w:bottom w:val="single" w:sz="4" w:space="0" w:color="C9D3DF"/>
+              <w:right w:val="single" w:sz="4" w:space="0" w:color="C9D3DF"/>
+            </w:tcBorders>
+            <w:shd w:val="clear" w:color="auto" w:fill="1F3A5F"/>
+            <w:tcMar>
+              <w:top w:w="60" w:type="dxa"/>
+              <w:left w:w="100" w:type="dxa"/>
+              <w:bottom w:w="60" w:type="dxa"/>
+              <w:right w:w="100" w:type="dxa"/>
+            </w:tcMar>
+          </w:tcPr>
+          <w:p>
+            <w:pPr>
+              <w:spacing w:before="0" w:after="0" w:line="264" w:lineRule="auto"/>
+              <w:jc w:val="left"/>
+            </w:pPr>
+            <w:r>
+              <w:rPr>
+                <w:b/>
+                <w:bCs/>
+                <w:color w:val="FFFFFF"/>
+                <w:sz w:val="19"/>
+                <w:szCs w:val="19"/>
+              </w:rPr>
+              <w:t xml:space="preserve">Lot</w:t>
+            </w:r>
+          </w:p>
+        </w:tc>
+        <w:tc>
+          <w:tcPr>
+            <w:tcW w:w="1300" w:type="dxa"/>
+            <w:tcBorders>
+              <w:top w:val="single" w:sz="4" w:space="0" w:color="C9D3DF"/>
+              <w:left w:val="single" w:sz="4" w:space="0" w:color="C9D3DF"/>
+              <w:bottom w:val="single" w:sz="4" w:space="0" w:color="C9D3DF"/>
+              <w:right w:val="single" w:sz="4" w:space="0" w:color="C9D3DF"/>
+            </w:tcBorders>
+            <w:shd w:val="clear" w:color="auto" w:fill="1F3A5F"/>
+            <w:tcMar>
+              <w:top w:w="60" w:type="dxa"/>
+              <w:left w:w="100" w:type="dxa"/>
+              <w:bottom w:w="60" w:type="dxa"/>
+              <w:right w:w="100" w:type="dxa"/>
+            </w:tcMar>
+          </w:tcPr>
+          <w:p>
+            <w:pPr>
+              <w:spacing w:before="0" w:after="0" w:line="264" w:lineRule="auto"/>
+              <w:jc w:val="right"/>
+            </w:pPr>
+            <w:r>
+              <w:rPr>
+                <w:b/>
+                <w:bCs/>
+                <w:color w:val="FFFFFF"/>
+                <w:sz w:val="19"/>
+                <w:szCs w:val="19"/>
+              </w:rPr>
+              <w:t xml:space="preserve">Tantièmes</w:t>
+            </w:r>
+          </w:p>
+        </w:tc>
+        <w:tc>
+          <w:tcPr>
+            <w:tcW w:w="3838" w:type="dxa"/>
+            <w:tcBorders>
+              <w:top w:val="single" w:sz="4" w:space="0" w:color="C9D3DF"/>
+              <w:left w:val="single" w:sz="4" w:space="0" w:color="C9D3DF"/>
+              <w:bottom w:val="single" w:sz="4" w:space="0" w:color="C9D3DF"/>
+              <w:right w:val="single" w:sz="4" w:space="0" w:color="C9D3DF"/>
+            </w:tcBorders>
+            <w:shd w:val="clear" w:color="auto" w:fill="1F3A5F"/>
+            <w:tcMar>
+              <w:top w:w="60" w:type="dxa"/>
+              <w:left w:w="100" w:type="dxa"/>
+              <w:bottom w:w="60" w:type="dxa"/>
+              <w:right w:w="100" w:type="dxa"/>
+            </w:tcMar>
+          </w:tcPr>
+          <w:p>
+            <w:pPr>
+              <w:spacing w:before="0" w:after="0" w:line="264" w:lineRule="auto"/>
+              <w:jc w:val="left"/>
+            </w:pPr>
+            <w:r>
+              <w:rPr>
+                <w:b/>
+                <w:bCs/>
+                <w:color w:val="FFFFFF"/>
+                <w:sz w:val="19"/>
+                <w:szCs w:val="19"/>
+              </w:rPr>
+              <w:t xml:space="preserve">Copropriétaire</w:t>
+            </w:r>
+          </w:p>
+        </w:tc>
+        <w:tc>
+          <w:tcPr>
+            <w:tcW w:w="2000" w:type="dxa"/>
+            <w:tcBorders>
+              <w:top w:val="single" w:sz="4" w:space="0" w:color="C9D3DF"/>
+              <w:left w:val="single" w:sz="4" w:space="0" w:color="C9D3DF"/>
+              <w:bottom w:val="single" w:sz="4" w:space="0" w:color="C9D3DF"/>
+              <w:right w:val="single" w:sz="4" w:space="0" w:color="C9D3DF"/>
+            </w:tcBorders>
+            <w:shd w:val="clear" w:color="auto" w:fill="1F3A5F"/>
+            <w:tcMar>
+              <w:top w:w="60" w:type="dxa"/>
+              <w:left w:w="100" w:type="dxa"/>
+              <w:bottom w:w="60" w:type="dxa"/>
+              <w:right w:w="100" w:type="dxa"/>
+            </w:tcMar>
+          </w:tcPr>
+          <w:p>
+            <w:pPr>
+              <w:spacing w:before="0" w:after="0" w:line="264" w:lineRule="auto"/>
+              <w:jc w:val="left"/>
+            </w:pPr>
+            <w:r>
+              <w:rPr>
+                <w:b/>
+                <w:bCs/>
+                <w:color w:val="FFFFFF"/>
+                <w:sz w:val="19"/>
+                <w:szCs w:val="19"/>
+              </w:rPr>
+              <w:t xml:space="preserve">Statut</w:t>
+            </w:r>
+          </w:p>
+        </w:tc>
+        <w:tc>
+          <w:tcPr>
+            <w:tcW w:w="1600" w:type="dxa"/>
+            <w:tcBorders>
+              <w:top w:val="single" w:sz="4" w:space="0" w:color="C9D3DF"/>
+              <w:left w:val="single" w:sz="4" w:space="0" w:color="C9D3DF"/>
+              <w:bottom w:val="single" w:sz="4" w:space="0" w:color="C9D3DF"/>
+              <w:right w:val="single" w:sz="4" w:space="0" w:color="C9D3DF"/>
+            </w:tcBorders>
+            <w:shd w:val="clear" w:color="auto" w:fill="1F3A5F"/>
+            <w:tcMar>
+              <w:top w:w="60" w:type="dxa"/>
+              <w:left w:w="100" w:type="dxa"/>
+              <w:bottom w:w="60" w:type="dxa"/>
+              <w:right w:w="100" w:type="dxa"/>
+            </w:tcMar>
+          </w:tcPr>
+          <w:p>
+            <w:pPr>
+              <w:spacing w:before="0" w:after="0" w:line="264" w:lineRule="auto"/>
+              <w:jc w:val="left"/>
+            </w:pPr>
+            <w:r>
+              <w:rPr>
+                <w:b/>
+                <w:bCs/>
+                <w:color w:val="FFFFFF"/>
+                <w:sz w:val="19"/>
+                <w:szCs w:val="19"/>
+              </w:rPr>
+              <w:t xml:space="preserve">Mode</w:t>
+            </w:r>
+          </w:p>
+        </w:tc>
+      </w:tr>
+      <w:tr>
+        <w:trPr>
+          <w:cantSplit/>
+        </w:trPr>
+        <w:tc>
+          <w:tcPr>
+            <w:tcW w:w="900" w:type="dxa"/>
+            <w:tcBorders>
+              <w:top w:val="single" w:sz="4" w:space="0" w:color="C9D3DF"/>
+              <w:left w:val="single" w:sz="4" w:space="0" w:color="C9D3DF"/>
+              <w:bottom w:val="single" w:sz="4" w:space="0" w:color="C9D3DF"/>
+              <w:right w:val="single" w:sz="4" w:space="0" w:color="C9D3DF"/>
+            </w:tcBorders>
+            <w:tcMar>
+              <w:top w:w="60" w:type="dxa"/>
+              <w:left w:w="100" w:type="dxa"/>
+              <w:bottom w:w="60" w:type="dxa"/>
+              <w:right w:w="100" w:type="dxa"/>
+            </w:tcMar>
+          </w:tcPr>
+          <w:p>
+            <w:pPr>
+              <w:spacing w:before="0" w:after="0" w:line="264" w:lineRule="auto"/>
+              <w:jc w:val="left"/>
+            </w:pPr>
+            <w:r>
+              <w:rPr>
+                <w:sz w:val="19"/>
+                <w:szCs w:val="19"/>
+              </w:rPr>
+              <w:t xml:space="preserve">{{#ATTENDANCE}}{{ATTENDANCE_LOT}}</w:t>
+            </w:r>
+          </w:p>
+        </w:tc>
+        <w:tc>
+          <w:tcPr>
+            <w:tcW w:w="1300" w:type="dxa"/>
+            <w:tcBorders>
+              <w:top w:val="single" w:sz="4" w:space="0" w:color="C9D3DF"/>
+              <w:left w:val="single" w:sz="4" w:space="0" w:color="C9D3DF"/>
+              <w:bottom w:val="single" w:sz="4" w:space="0" w:color="C9D3DF"/>
+              <w:right w:val="single" w:sz="4" w:space="0" w:color="C9D3DF"/>
+            </w:tcBorders>
+            <w:tcMar>
+              <w:top w:w="60" w:type="dxa"/>
+              <w:left w:w="100" w:type="dxa"/>
+              <w:bottom w:w="60" w:type="dxa"/>
+              <w:right w:w="100" w:type="dxa"/>
+            </w:tcMar>
+          </w:tcPr>
+          <w:p>
+            <w:pPr>
+              <w:spacing w:before="0" w:after="0" w:line="264" w:lineRule="auto"/>
+              <w:jc w:val="right"/>
+            </w:pPr>
+            <w:r>
+              <w:rPr>
+                <w:sz w:val="19"/>
+                <w:szCs w:val="19"/>
+              </w:rPr>
+              <w:t xml:space="preserve">{{ATTENDANCE_SHARES}}</w:t>
+            </w:r>
+          </w:p>
+        </w:tc>
+        <w:tc>
+          <w:tcPr>
+            <w:tcW w:w="3838" w:type="dxa"/>
+            <w:tcBorders>
+              <w:top w:val="single" w:sz="4" w:space="0" w:color="C9D3DF"/>
+              <w:left w:val="single" w:sz="4" w:space="0" w:color="C9D3DF"/>
+              <w:bottom w:val="single" w:sz="4" w:space="0" w:color="C9D3DF"/>
+              <w:right w:val="single" w:sz="4" w:space="0" w:color="C9D3DF"/>
+            </w:tcBorders>
+            <w:tcMar>
+              <w:top w:w="60" w:type="dxa"/>
+              <w:left w:w="100" w:type="dxa"/>
+              <w:bottom w:w="60" w:type="dxa"/>
+              <w:right w:w="100" w:type="dxa"/>
+            </w:tcMar>
+          </w:tcPr>
+          <w:p>
+            <w:pPr>
+              <w:spacing w:before="0" w:after="0" w:line="264" w:lineRule="auto"/>
+              <w:jc w:val="left"/>
+            </w:pPr>
+            <w:r>
+              <w:rPr>
+                <w:sz w:val="19"/>
+                <w:szCs w:val="19"/>
+              </w:rPr>
+              <w:t xml:space="preserve">{{ATTENDANCE_PERSON}}</w:t>
+            </w:r>
+          </w:p>
+        </w:tc>
+        <w:tc>
+          <w:tcPr>
+            <w:tcW w:w="2000" w:type="dxa"/>
+            <w:tcBorders>
+              <w:top w:val="single" w:sz="4" w:space="0" w:color="C9D3DF"/>
+              <w:left w:val="single" w:sz="4" w:space="0" w:color="C9D3DF"/>
+              <w:bottom w:val="single" w:sz="4" w:space="0" w:color="C9D3DF"/>
+              <w:right w:val="single" w:sz="4" w:space="0" w:color="C9D3DF"/>
+            </w:tcBorders>
+            <w:tcMar>
+              <w:top w:w="60" w:type="dxa"/>
+              <w:left w:w="100" w:type="dxa"/>
+              <w:bottom w:w="60" w:type="dxa"/>
+              <w:right w:w="100" w:type="dxa"/>
+            </w:tcMar>
+          </w:tcPr>
+          <w:p>
+            <w:pPr>
+              <w:spacing w:before="0" w:after="0" w:line="264" w:lineRule="auto"/>
+              <w:jc w:val="left"/>
+            </w:pPr>
+            <w:r>
+              <w:rPr>
+                <w:sz w:val="19"/>
+                <w:szCs w:val="19"/>
+              </w:rPr>
+              <w:t xml:space="preserve">{{ATTENDANCE_STATUS}}</w:t>
+            </w:r>
+          </w:p>
+        </w:tc>
+        <w:tc>
+          <w:tcPr>
+            <w:tcW w:w="1600" w:type="dxa"/>
+            <w:tcBorders>
+              <w:top w:val="single" w:sz="4" w:space="0" w:color="C9D3DF"/>
+              <w:left w:val="single" w:sz="4" w:space="0" w:color="C9D3DF"/>
+              <w:bottom w:val="single" w:sz="4" w:space="0" w:color="C9D3DF"/>
+              <w:right w:val="single" w:sz="4" w:space="0" w:color="C9D3DF"/>
+            </w:tcBorders>
+            <w:tcMar>
+              <w:top w:w="60" w:type="dxa"/>
+              <w:left w:w="100" w:type="dxa"/>
+              <w:bottom w:w="60" w:type="dxa"/>
+              <w:right w:w="100" w:type="dxa"/>
+            </w:tcMar>
+          </w:tcPr>
+          <w:p>
+            <w:pPr>
+              <w:spacing w:before="0" w:after="0" w:line="264" w:lineRule="auto"/>
+              <w:jc w:val="left"/>
+            </w:pPr>
+            <w:r>
+              <w:rPr>
+                <w:sz w:val="19"/>
+                <w:szCs w:val="19"/>
+              </w:rPr>
+              <w:t xml:space="preserve">{{ATTENDANCE_MODE}}{{/ATTENDANCE}}</w:t>
+            </w:r>
+          </w:p>
+        </w:tc>
+      </w:tr>
+    </w:tbl>
+    <w:p>
+      <w:pPr>
+        <w:spacing w:before="0" w:after="0" w:line="100" w:lineRule="exact"/>
+      </w:pPr>
     </w:p>
     <w:p>
       <w:pPr>
@@ -514,7 +831,7 @@
           <w:sz w:val="22"/>
           <w:szCs w:val="22"/>
         </w:rPr>
-        <w:t xml:space="preserve">RÉSOLUTIONS ET RÉSULTATS</w:t>
+        <w:t xml:space="preserve">ORDRE DU JOUR ET DISCUSSIONS</w:t>
       </w:r>
     </w:p>
     <w:p>
@@ -522,7 +839,7 @@
         <w:spacing w:before="0" w:after="80" w:line="264" w:lineRule="auto"/>
       </w:pPr>
       <w:r>
-        <w:t xml:space="preserve">{{^RESOLUTIONS}}- Aucune résolution enregistrée.{{/RESOLUTIONS}}</w:t>
+        <w:t xml:space="preserve">{{^AGENDA_ITEMS}}- Aucun point d’ordre du jour renseigné.{{/AGENDA_ITEMS}}</w:t>
       </w:r>
     </w:p>
     <w:p>
@@ -530,7 +847,7 @@
         <w:spacing w:before="0" w:after="80" w:line="264" w:lineRule="auto"/>
       </w:pPr>
       <w:r>
-        <w:t xml:space="preserve">{{#RESOLUTIONS}}</w:t>
+        <w:t xml:space="preserve">{{#AGENDA_ITEMS}}</w:t>
       </w:r>
     </w:p>
     <w:p>
@@ -542,60 +859,23 @@
           <w:b/>
           <w:bCs/>
         </w:rPr>
-        <w:t xml:space="preserve">{{RESOLUTION_INDEX}}. {{RESOLUTION_TITLE}}</w:t>
-      </w:r>
-    </w:p>
-    <w:p>
-      <w:pPr>
-        <w:spacing w:before="0" w:after="30" w:line="264" w:lineRule="auto"/>
-      </w:pPr>
-      <w:r>
-        <w:t xml:space="preserve">Description : {{RESOLUTION_DESCRIPTION}}</w:t>
-      </w:r>
-    </w:p>
-    <w:p>
-      <w:pPr>
-        <w:spacing w:before="0" w:after="30" w:line="264" w:lineRule="auto"/>
-      </w:pPr>
-      <w:r>
-        <w:t xml:space="preserve">Règle de majorité : {{RESOLUTION_MAJORITY_RULE}}</w:t>
-      </w:r>
-    </w:p>
-    <w:p>
-      <w:pPr>
-        <w:spacing w:before="0" w:after="30" w:line="264" w:lineRule="auto"/>
-      </w:pPr>
-      <w:r>
-        <w:t xml:space="preserve">Votes : pour {{RESOLUTION_VOTES_FOR}}, contre {{RESOLUTION_VOTES_AGAINST}}, abstention {{RESOLUTION_VOTES_ABSTAIN}}</w:t>
-      </w:r>
-    </w:p>
-    <w:p>
-      <w:pPr>
-        <w:spacing w:before="0" w:after="30" w:line="264" w:lineRule="auto"/>
-      </w:pPr>
-      <w:r>
-        <w:t xml:space="preserve">{{RESOLUTION_TANTIEMES}}</w:t>
-      </w:r>
-    </w:p>
-    <w:p>
-      <w:pPr>
-        <w:spacing w:before="0" w:after="30" w:line="264" w:lineRule="auto"/>
-      </w:pPr>
-      <w:r>
-        <w:t xml:space="preserve">Résultat : {{RESOLUTION_RESULT}}</w:t>
-      </w:r>
-    </w:p>
-    <w:p>
-      <w:pPr>
-        <w:spacing w:before="0" w:after="0" w:line="60" w:lineRule="exact"/>
-      </w:pPr>
+        <w:t xml:space="preserve">{{AGENDA_INDEX}}. {{AGENDA_TITLE}}</w:t>
+      </w:r>
     </w:p>
     <w:p>
       <w:pPr>
         <w:spacing w:before="0" w:after="80" w:line="264" w:lineRule="auto"/>
       </w:pPr>
       <w:r>
-        <w:t xml:space="preserve">{{/RESOLUTIONS}}</w:t>
+        <w:t xml:space="preserve">Discussion : {{AGENDA_DISCUSSION}}</w:t>
+      </w:r>
+    </w:p>
+    <w:p>
+      <w:pPr>
+        <w:spacing w:before="0" w:after="80" w:line="264" w:lineRule="auto"/>
+      </w:pPr>
+      <w:r>
+        <w:t xml:space="preserve">{{/AGENDA_ITEMS}}</w:t>
       </w:r>
     </w:p>
     <w:p>
@@ -614,7 +894,7 @@
           <w:sz w:val="22"/>
           <w:szCs w:val="22"/>
         </w:rPr>
-        <w:t xml:space="preserve">POUVOIRS</w:t>
+        <w:t xml:space="preserve">RÉSOLUTIONS ET RÉSULTATS</w:t>
       </w:r>
     </w:p>
     <w:p>
@@ -622,7 +902,7 @@
         <w:spacing w:before="0" w:after="80" w:line="264" w:lineRule="auto"/>
       </w:pPr>
       <w:r>
-        <w:t xml:space="preserve">{{^PROXIES}}Aucun pouvoir enregistré.{{/PROXIES}}</w:t>
+        <w:t xml:space="preserve">{{^RESOLUTIONS}}- Aucune résolution enregistrée.{{/RESOLUTIONS}}</w:t>
       </w:r>
     </w:p>
     <w:p>
@@ -630,7 +910,7 @@
         <w:spacing w:before="0" w:after="80" w:line="264" w:lineRule="auto"/>
       </w:pPr>
       <w:r>
-        <w:t xml:space="preserve">{{#PROXIES}}</w:t>
+        <w:t xml:space="preserve">{{#RESOLUTIONS}}</w:t>
       </w:r>
     </w:p>
     <w:p>
@@ -638,15 +918,64 @@
         <w:spacing w:before="0" w:after="80" w:line="264" w:lineRule="auto"/>
       </w:pPr>
       <w:r>
-        <w:t xml:space="preserve">- {{PROXY_GRANTOR}} est représenté(e) par {{PROXY_REPRESENTATIVE}}.</w:t>
-      </w:r>
+        <w:rPr>
+          <w:b/>
+          <w:bCs/>
+        </w:rPr>
+        <w:t xml:space="preserve">{{RESOLUTION_INDEX}}. {{RESOLUTION_TITLE}}</w:t>
+      </w:r>
+    </w:p>
+    <w:p>
+      <w:pPr>
+        <w:spacing w:before="0" w:after="30" w:line="264" w:lineRule="auto"/>
+      </w:pPr>
+      <w:r>
+        <w:t xml:space="preserve">Description : {{RESOLUTION_DESCRIPTION}}</w:t>
+      </w:r>
+    </w:p>
+    <w:p>
+      <w:pPr>
+        <w:spacing w:before="0" w:after="30" w:line="264" w:lineRule="auto"/>
+      </w:pPr>
+      <w:r>
+        <w:t xml:space="preserve">Règle de majorité : {{RESOLUTION_MAJORITY_RULE}}</w:t>
+      </w:r>
+    </w:p>
+    <w:p>
+      <w:pPr>
+        <w:spacing w:before="0" w:after="30" w:line="264" w:lineRule="auto"/>
+      </w:pPr>
+      <w:r>
+        <w:t xml:space="preserve">Votes : pour {{RESOLUTION_VOTES_FOR}}, contre {{RESOLUTION_VOTES_AGAINST}}, abstention {{RESOLUTION_VOTES_ABSTAIN}}</w:t>
+      </w:r>
+    </w:p>
+    <w:p>
+      <w:pPr>
+        <w:spacing w:before="0" w:after="30" w:line="264" w:lineRule="auto"/>
+      </w:pPr>
+      <w:r>
+        <w:t xml:space="preserve">{{RESOLUTION_TANTIEMES}}</w:t>
+      </w:r>
+    </w:p>
+    <w:p>
+      <w:pPr>
+        <w:spacing w:before="0" w:after="30" w:line="264" w:lineRule="auto"/>
+      </w:pPr>
+      <w:r>
+        <w:t xml:space="preserve">Résultat : {{RESOLUTION_RESULT}}</w:t>
+      </w:r>
+    </w:p>
+    <w:p>
+      <w:pPr>
+        <w:spacing w:before="0" w:after="0" w:line="60" w:lineRule="exact"/>
+      </w:pPr>
     </w:p>
     <w:p>
       <w:pPr>
         <w:spacing w:before="0" w:after="80" w:line="264" w:lineRule="auto"/>
       </w:pPr>
       <w:r>
-        <w:t xml:space="preserve">{{/PROXIES}}</w:t>
+        <w:t xml:space="preserve">{{/RESOLUTIONS}}</w:t>
       </w:r>
     </w:p>
     <w:p>
@@ -665,11 +994,63 @@
           <w:sz w:val="22"/>
           <w:szCs w:val="22"/>
         </w:rPr>
+        <w:t xml:space="preserve">POUVOIRS</w:t>
+      </w:r>
+    </w:p>
+    <w:p>
+      <w:pPr>
+        <w:spacing w:before="0" w:after="80" w:line="264" w:lineRule="auto"/>
+      </w:pPr>
+      <w:r>
+        <w:t xml:space="preserve">{{^PROXIES}}Aucun pouvoir enregistré.{{/PROXIES}}</w:t>
+      </w:r>
+    </w:p>
+    <w:p>
+      <w:pPr>
+        <w:spacing w:before="0" w:after="80" w:line="264" w:lineRule="auto"/>
+      </w:pPr>
+      <w:r>
+        <w:t xml:space="preserve">{{#PROXIES}}</w:t>
+      </w:r>
+    </w:p>
+    <w:p>
+      <w:pPr>
+        <w:spacing w:before="0" w:after="80" w:line="264" w:lineRule="auto"/>
+      </w:pPr>
+      <w:r>
+        <w:t xml:space="preserve">- {{PROXY_GRANTOR}} est représenté(e) par {{PROXY_REPRESENTATIVE}}.</w:t>
+      </w:r>
+    </w:p>
+    <w:p>
+      <w:pPr>
+        <w:spacing w:before="0" w:after="80" w:line="264" w:lineRule="auto"/>
+      </w:pPr>
+      <w:r>
+        <w:t xml:space="preserve">{{/PROXIES}}</w:t>
+      </w:r>
+    </w:p>
+    <w:p>
+      <w:pPr>
+        <w:keepNext/>
+        <w:pBdr>
+          <w:bottom w:val="single" w:sz="8" w:space="4" w:color="C9D3DF"/>
+        </w:pBdr>
+        <w:spacing w:before="240" w:after="100" w:line="264" w:lineRule="auto"/>
+      </w:pPr>
+      <w:r>
+        <w:rPr>
+          <w:b/>
+          <w:bCs/>
+          <w:color w:val="1F3A5F"/>
+          <w:sz w:val="22"/>
+          <w:szCs w:val="22"/>
+        </w:rPr>
         <w:t xml:space="preserve">SYNTHÈSE</w:t>
       </w:r>
     </w:p>
     <w:p>
       <w:pPr>
+        <w:keepNext/>
         <w:spacing w:before="0" w:after="80" w:line="264" w:lineRule="auto"/>
       </w:pPr>
       <w:r>
@@ -678,6 +1059,7 @@
     </w:p>
     <w:p>
       <w:pPr>
+        <w:keepNext/>
         <w:spacing w:before="0" w:after="0" w:line="160" w:lineRule="exact"/>
       </w:pPr>
     </w:p>
@@ -716,6 +1098,7 @@
           </w:tcPr>
           <w:p>
             <w:pPr>
+              <w:keepNext/>
               <w:spacing w:before="0" w:after="40" w:line="264" w:lineRule="auto"/>
             </w:pPr>
             <w:r>
@@ -729,6 +1112,7 @@
           </w:p>
           <w:p>
             <w:pPr>
+              <w:keepNext/>
               <w:spacing w:before="0" w:after="40" w:line="264" w:lineRule="auto"/>
             </w:pPr>
             <w:r>
@@ -764,6 +1148,7 @@
           </w:tcPr>
           <w:p>
             <w:pPr>
+              <w:keepNext/>
               <w:spacing w:before="0" w:after="40" w:line="264" w:lineRule="auto"/>
             </w:pPr>
             <w:r>
@@ -777,6 +1162,7 @@
           </w:p>
           <w:p>
             <w:pPr>
+              <w:keepNext/>
               <w:spacing w:before="0" w:after="40" w:line="264" w:lineRule="auto"/>
             </w:pPr>
             <w:r>

</xml_diff>